<commit_message>
Re-run Hair Colour study synthesis with dedicated skill
Synthesis skill with fresh context window rewrites all 16 insights
with deeper observations, explanatory frameworks, and more specific
recommendations. Narrative review skipped (0% unthemed).

Co-Authored-By: Claude Opus 4.6 (1M context) <noreply@anthropic.com>
</commit_message>
<xml_diff>
--- a/examples/outcomes/hair_colour/hair_colour_report.docx
+++ b/examples/outcomes/hair_colour/hair_colour_report.docx
@@ -1268,7 +1268,21 @@
           <w:i w:val="0"/>
           <w:sz w:val="22"/>
         </w:rPr>
-        <w:t>Data was collected using automated scrapers with engagement-weighted filtering applied per platform. Thread-level deduplication caps comments per thread to prevent over-indexing vocal threads. All items passed an LLM relevance classification step before analysis.</w:t>
+        <w:t>Data was ingested from externally collected sources. The original collection methodology, sampling strategy, and any platform-specific filtering applied prior to ingestion are not documented in this pipeline and should be considered unknown.</w:t>
+      </w:r>
+    </w:p>
+    <w:p>
+      <w:pPr>
+        <w:spacing w:after="120" w:before="0"/>
+      </w:pPr>
+      <w:r>
+        <w:rPr>
+          <w:rFonts w:ascii="Lato" w:hAnsi="Lato"/>
+          <w:b w:val="0"/>
+          <w:i w:val="0"/>
+          <w:sz w:val="22"/>
+        </w:rPr>
+        <w:t>Thread-level deduplication caps comments per thread (max 5, randomly selected) to prevent over-indexing vocal threads. Engagement metrics are preserved as metadata for signal strength scoring but do not gate corpus admission. All items passed an LLM relevance classification step before analysis.</w:t>
       </w:r>
     </w:p>
     <w:p>
@@ -5707,7 +5721,7 @@
           <w:i w:val="0"/>
           <w:sz w:val="22"/>
         </w:rPr>
-        <w:t>3,730 consumer mentions (41.6% prevalence) - the largest theme - discuss home hair colouring experiences. Conversations cover application tutorials, ease-of-use reviews, mess management, and comparisons between product formats. NSS of +0.27 shows positive sentiment overall, with negatives concentrated around messy application and skin staining.</w:t>
+        <w:t>DIY Home Colouring Experience is the dominant theme at 3,730 items (41.6% prevalence) with moderate positive sentiment (1,011 positive, 264 negative, 2,316 neutral, 139 mixed; NSS +20.0%). The very high neutral count (62% of items) and presence across all five platforms indicates this is largely informational and tutorial-driven content.</w:t>
       </w:r>
     </w:p>
     <w:p>
@@ -5736,7 +5750,7 @@
           <w:i w:val="0"/>
           <w:sz w:val="22"/>
         </w:rPr>
-        <w:t>The home colouring market in India is undergoing a format revolution - shampoo-based hair colours that promise salon results in 5-10 minutes are rapidly displacing traditional cream-based box dyes. The primary driver is not cost savings but time efficiency and the desire to colour hair as casually as shampooing.</w:t>
+        <w:t>The massive scale of DIY colouring content (4 in 10 corpus items) combined with the unusually high neutral proportion reveals that hair colouring at home is treated as a skill to be learned rather than a product to be purchased. Consumers are seeking instruction and validation - they want to know they are doing it right. The 264 negative mentions likely cluster around application failures (uneven results, mess, skin staining) rather than product dissatisfaction, meaning the brand's reputation is being shaped by the consumer's technique as much as the formulation itself. This creates a paradox: the product gets blamed for the user's skill deficit.</w:t>
       </w:r>
     </w:p>
     <w:p>
@@ -5765,7 +5779,7 @@
           <w:i w:val="0"/>
           <w:sz w:val="22"/>
         </w:rPr>
-        <w:t>Product format is becoming as important as colour quality in driving purchase decisions. Traditional cream-based hair colours risk losing market share not on colour quality but on friction.</w:t>
+        <w:t>The brand that owns the education layer of home colouring captures the consumer at the moment of highest uncertainty and lowest confidence - application time. This is a defensible competitive advantage because tutorial content creates habitual product-technique pairings that competitors cannot easily break. The 2,316 neutral items represent an enormous unmonetised audience seeking guidance - these are consumers who have not yet formed strong product opinions and are most susceptible to brand influence through helpful content.</w:t>
       </w:r>
     </w:p>
     <w:p>
@@ -5794,7 +5808,7 @@
           <w:i w:val="0"/>
           <w:sz w:val="22"/>
         </w:rPr>
-        <w:t>Accelerate development of shampoo-based and instant-format hair colours that deliver professional-grade coverage in under 10 minutes. Invest in packaging innovation that eliminates mixing and reduces mess.</w:t>
+        <w:t>Invest in a comprehensive DIY education ecosystem: (1) Create a tiered YouTube tutorial series - 'First Timer', 'Intermediate', and 'Salon-Quality at Home' - for each major product line, featuring real consumers not professionals. (2) Develop in-pack QR codes linking to shade-specific application videos. (3) Build an AI-powered shade advisor tool on the brand website/app that recommends products AND shows application technique for the consumer's hair type. (4) Partner with 10-15 mid-tier beauty creators (50K-500K followers) for authentic DIY content on Instagram Reels and YouTube Shorts, with measurement via branded hashtag tracking.</w:t>
       </w:r>
     </w:p>
     <w:p>
@@ -5823,7 +5837,7 @@
           <w:i w:val="0"/>
           <w:sz w:val="22"/>
         </w:rPr>
-        <w:t>Track the format mix shift in Indian hair colour sales data - shampoo vs. cream vs. powder vs. spray.</w:t>
+        <w:t>Conduct a UX research study (n=30, recorded home colouring sessions with think-aloud protocol, split by first-time and experienced users) to identify the top 5 application failure points and the specific moments where consumers feel uncertain. Key question: 'At what point during application did you feel least confident, and what information would have helped?'</w:t>
       </w:r>
     </w:p>
     <w:p>
@@ -6108,7 +6122,7 @@
           <w:i w:val="0"/>
           <w:sz w:val="22"/>
         </w:rPr>
-        <w:t>1,599 consumer mentions (17.8% prevalence) discuss shade preferences, colour vibrancy, and shade accuracy. Natural black and brown shades dominate Indian conversations, but burgundy is the most popular fashion shade. Consumers frequently report actual colour results differing from shade cards.</w:t>
+        <w:t>Shade Selection &amp; Colour Accuracy is the second-largest theme at 1,599 items (17.8% prevalence) with the highest positive sentiment of any theme (1,121 positive, 84 negative, 347 neutral, 47 mixed; NSS +64.9%). Conversations focus on shade preferences, colour vibrancy, naturalness of results, and shade matching expectations.</w:t>
       </w:r>
     </w:p>
     <w:p>
@@ -6137,7 +6151,7 @@
           <w:i w:val="0"/>
           <w:sz w:val="22"/>
         </w:rPr>
-        <w:t>Indian consumers have a paradoxical relationship with shade selection - they overwhelmingly buy natural black and brown shades to look natural while being drawn to burgundy for self-expression. When the delivered shade does not match expectations, the sense of betrayal is acute because colour is the primary reason for purchase.</w:t>
+        <w:t>The exceptionally high NSS (+64.9%) combined with the relatively low negative count (only 84 of 1,599) reveals that shade selection is the primary driver of delight in hair colour - not application ease, not longevity, not safety. When consumers get the shade right, the experience is overwhelmingly positive. This suggests that shade accuracy functions as a 'gateway satisfaction factor' - get it right and other frictions (messy application, slight fading) are forgiven; get it wrong and nothing else matters. The 84 negative mentions, though few, likely carry outsized impact because shade disappointment is visually obvious and socially embarrassing in a way that other product failures are not.</w:t>
       </w:r>
     </w:p>
     <w:p>
@@ -6166,7 +6180,7 @@
           <w:i w:val="0"/>
           <w:sz w:val="22"/>
         </w:rPr>
-        <w:t>Shade accuracy is a differentiator that most brands underinvest in. Current shade cards show idealised results on virgin light hair, bearing no resemblance to application on Indian dark hair.</w:t>
+        <w:t>Shade accuracy is the single highest-leverage investment a hair colour brand can make. It has the best sentiment-to-volume ratio in the entire corpus, meaning improvements here yield the highest return per consumer touched. Brands that invest in shade accuracy technology (better pigment formulation, more precise shade guides, virtual try-on) gain a compounding advantage: satisfied shade consumers become organic advocates, while shade-disappointed consumers become vocal detractors.</w:t>
       </w:r>
     </w:p>
     <w:p>
@@ -6195,7 +6209,7 @@
           <w:i w:val="0"/>
           <w:sz w:val="22"/>
         </w:rPr>
-        <w:t>Redesign shade communication to show realistic results on Indian hair. Create a digital shade try-on tool calibrated for Indian skin tones. For burgundy, develop a range of sub-shades (wine, cherry, plum, mahogany).</w:t>
+        <w:t>Triple down on shade accuracy as the core brand differentiator: (1) Develop an AR shade try-on tool for the brand app/website using the consumer's selfie camera, with lighting correction to show realistic results. (2) Expand shade libraries with Indian skin tone and hair texture specificity - current shade cards are often optimised for Western hair types. (3) Introduce a 'Shade Match Guarantee' - if the shade result does not match the guide, offer a free replacement in a corrected shade. (4) Commission professional shade swatch photography on diverse Indian hair types (grey, black, brown base) for e-commerce listings to reduce expectation gaps.</w:t>
       </w:r>
     </w:p>
     <w:p>
@@ -6224,7 +6238,7 @@
           <w:i w:val="0"/>
           <w:sz w:val="22"/>
         </w:rPr>
-        <w:t>Conduct a shade perception study showing Indian consumers actual results on Indian hair vs. current shade card imagery.</w:t>
+        <w:t>Conduct a conjoint analysis (n=400, active hair colour users in India) measuring the relative utility of shade accuracy vs. longevity vs. safety vs. price vs. ease of application in driving purchase preference. Specific question: 'How much more would you pay for guaranteed shade accuracy?' to quantify the willingness-to-pay premium for shade precision.</w:t>
       </w:r>
     </w:p>
     <w:p>
@@ -6343,7 +6357,7 @@
           <w:color w:val="1E3A5F"/>
           <w:sz w:val="32"/>
         </w:rPr>
-        <w:t>03. Product Format Innovation</w:t>
+        <w:t>03. Natural &amp; Herbal Hair Colour</w:t>
       </w:r>
     </w:p>
     <w:p>
@@ -6358,7 +6372,7 @@
           <w:color w:val="6B7280"/>
           <w:sz w:val="18"/>
         </w:rPr>
-        <w:t>n=1348</w:t>
+        <w:t>n=954</w:t>
       </w:r>
       <w:r>
         <w:rPr>
@@ -6398,7 +6412,7 @@
           <w:color w:val="374151"/>
           <w:sz w:val="18"/>
         </w:rPr>
-        <w:t>57% (Moderate)</w:t>
+        <w:t>59% (Moderate)</w:t>
       </w:r>
       <w:r>
         <w:rPr>
@@ -6408,7 +6422,7 @@
           <w:color w:val="6B7280"/>
           <w:sz w:val="18"/>
         </w:rPr>
-        <w:t xml:space="preserve">  |  15.0% of Dataset</w:t>
+        <w:t xml:space="preserve">  |  10.6% of Dataset</w:t>
       </w:r>
       <w:r>
         <w:rPr>
@@ -6428,7 +6442,7 @@
           <w:color w:val="059669"/>
           <w:sz w:val="18"/>
         </w:rPr>
-        <w:t>+24%</w:t>
+        <w:t>+36%</w:t>
       </w:r>
     </w:p>
     <w:p>
@@ -6447,7 +6461,7 @@
               <a:graphicData uri="http://schemas.openxmlformats.org/drawingml/2006/picture">
                 <pic:pic>
                   <pic:nvPicPr>
-                    <pic:cNvPr id="0" name="chart_radar_INS_014.png"/>
+                    <pic:cNvPr id="0" name="chart_radar_INS_002.png"/>
                     <pic:cNvPicPr/>
                   </pic:nvPicPr>
                   <pic:blipFill>
@@ -6483,7 +6497,7 @@
           <w:color w:val="6B7280"/>
           <w:sz w:val="18"/>
         </w:rPr>
-        <w:t>Score Breakdown: Product Format Innovation</w:t>
+        <w:t>Score Breakdown: Natural &amp; Herbal Hair Colour</w:t>
       </w:r>
     </w:p>
     <w:p>
@@ -6512,7 +6526,7 @@
           <w:i w:val="0"/>
           <w:sz w:val="22"/>
         </w:rPr>
-        <w:t>1,348 consumer mentions (15.0% prevalence) discuss innovative hair colour formats - foam dyes, shampoo colours, hair chalk, colour wax, spray colours, colour sticks, and colour-depositing conditioners. Asian foam dyes have gone viral. Indian consumers specifically seek 5-10 minute shampoo-based solutions.</w:t>
+        <w:t>Natural &amp; Herbal Hair Colour is the second-largest theme at 954 items (10.6% prevalence) with positive sentiment (463 positive, 117 negative, 314 neutral, 60 mixed; NSS +36.3%). Discussion centres on henna, mehendi, amla, indigo, and ayurvedic approaches across all five platforms.</w:t>
       </w:r>
     </w:p>
     <w:p>
@@ -6541,7 +6555,7 @@
           <w:i w:val="0"/>
           <w:sz w:val="22"/>
         </w:rPr>
-        <w:t>Product format has become the primary battleground in Indian hair colour, overtaking shade range and brand name as the key differentiator. Consumers are choosing products based on 'how easy is this to apply' before asking 'what shade does it come in'. The format hierarchy in Indian consumer preference is: shampoo &gt; foam &gt; cream &gt; powder, with spray and wax growing fast in the fashion segment.</w:t>
+        <w:t>The demand for natural/herbal colour is driven less by ingredient knowledge and more by a trust deficit with chemical products. Consumers use 'natural' as a proxy for 'safe' in a market where they lack the technical literacy to evaluate ingredient lists. Henna occupies a unique cultural position in India - it is not merely a 'natural alternative' but a heritage practice with generational endorsement. This creates an asymmetric competitive dynamic: chemical brands must prove safety (negative framing), while herbal brands inherit trust (positive framing).</w:t>
       </w:r>
     </w:p>
     <w:p>
@@ -6570,7 +6584,7 @@
           <w:i w:val="0"/>
           <w:sz w:val="22"/>
         </w:rPr>
-        <w:t>Brands still leading with shade range in their marketing are missing the consumer's actual decision criteria. Format innovation - particularly reducing application time below 10 minutes - is where market share will shift in the next 2-3 years.</w:t>
+        <w:t>Chemical hair colour brands face a structural credibility challenge in the Indian market that cannot be solved with ingredient transparency alone, because the trust gap is cultural rather than informational. Brands that try to compete with herbal positioning without authentic heritage credentials risk being seen as opportunistic. The opportunity for chemical brands is to reframe the conversation from 'safe vs. unsafe ingredients' to 'predictable vs. unpredictable results' - an axis where chemical formulations have a genuine advantage over henna.</w:t>
       </w:r>
     </w:p>
     <w:p>
@@ -6599,7 +6613,7 @@
           <w:i w:val="0"/>
           <w:sz w:val="22"/>
         </w:rPr>
-        <w:t>Map your product portfolio against the format preference hierarchy. If under-indexed in shampoo and foam formats, prioritise R&amp;D investment there. For existing cream products, reposition around quality superiority ('worth the extra 5 minutes') rather than competing on convenience.</w:t>
+        <w:t>For chemical brands: launch an educational content series on YouTube and Instagram demonstrating side-by-side colour predictability (chemical vs. henna) with diverse hair types, emphasising consistency of results rather than safety claims. Partner with dermatologists for credibility. For herbal brands: invest in standardisation and shade range expansion - the 117 negative mentions likely include frustration with limited shade options and inconsistent results. Develop a 'Heritage + Science' positioning that pairs ayurvedic ingredients with modern formulation technology.</w:t>
       </w:r>
     </w:p>
     <w:p>
@@ -6628,7 +6642,7 @@
           <w:i w:val="0"/>
           <w:sz w:val="22"/>
         </w:rPr>
-        <w:t>Conduct a format preference study across Indian demographics to validate the shampoo &gt; foam &gt; cream hierarchy and identify whether it varies by age, gender, and urban/rural segments.</w:t>
+        <w:t>Conduct qualitative research (8 focus groups, 6-8 participants each, split by current chemical vs. herbal users across 4 Indian metros) exploring the decision heuristics consumers use when choosing between chemical and natural products. Key question: 'What would need to change about chemical/herbal products for you to switch to the other type?' to identify the actual barriers vs. stated preferences.</w:t>
       </w:r>
     </w:p>
     <w:p>
@@ -6659,7 +6673,7 @@
           <w:color w:val="374151"/>
           <w:sz w:val="20"/>
         </w:rPr>
-        <w:t>"Instant hair color: Fantastically color the hair without putting any effort loving this"</w:t>
+        <w:t>"Natural Color: Color looks natural, covered greys fully, no strong smell, hair feels soft after use, easy instructions, lasted weeks well enough."</w:t>
       </w:r>
       <w:r>
         <w:rPr>
@@ -6685,7 +6699,7 @@
           <w:color w:val="374151"/>
           <w:sz w:val="20"/>
         </w:rPr>
-        <w:t>"Not true, my son has texture powder clay and sea salt spray spray and clay the only thing that holds his hair"</w:t>
+        <w:t>"Clear skin सपोर्ट हेतु Planet Ayurveda का Gleaming Skin Hair Nails Formula Capsules त्वचा पोषण में सहायक है।"</w:t>
       </w:r>
       <w:r>
         <w:rPr>
@@ -6711,7 +6725,7 @@
           <w:color w:val="374151"/>
           <w:sz w:val="20"/>
         </w:rPr>
-        <w:t>"@MvpRoaring I know about hair color and it's chemicals. I have had blue hair before. But whatever it's applied on hair was thru spray form which is not ideal hair color application whether it's permanent or temp"</w:t>
+        <w:t>"@code_mom_ @stardewy_ I have always done box dyes, and the only time I ever have color issues is when going from blonde to a non-natural color. I've never gotten green or grey unintentionally when going from blonde to brown, and I've done it quite a few times without issue."</w:t>
       </w:r>
       <w:r>
         <w:rPr>
@@ -6744,7 +6758,7 @@
           <w:color w:val="1E3A5F"/>
           <w:sz w:val="32"/>
         </w:rPr>
-        <w:t>04. Natural &amp; Herbal Hair Colour</w:t>
+        <w:t>04. Grey Hair Coverage &amp; Root Touch-Up</w:t>
       </w:r>
     </w:p>
     <w:p>
@@ -6759,7 +6773,7 @@
           <w:color w:val="6B7280"/>
           <w:sz w:val="18"/>
         </w:rPr>
-        <w:t>n=954</w:t>
+        <w:t>n=937</w:t>
       </w:r>
       <w:r>
         <w:rPr>
@@ -6799,7 +6813,7 @@
           <w:color w:val="374151"/>
           <w:sz w:val="18"/>
         </w:rPr>
-        <w:t>59% (Moderate)</w:t>
+        <w:t>58% (Moderate)</w:t>
       </w:r>
       <w:r>
         <w:rPr>
@@ -6809,7 +6823,7 @@
           <w:color w:val="6B7280"/>
           <w:sz w:val="18"/>
         </w:rPr>
-        <w:t xml:space="preserve">  |  10.6% of Dataset</w:t>
+        <w:t xml:space="preserve">  |  10.4% of Dataset</w:t>
       </w:r>
       <w:r>
         <w:rPr>
@@ -6829,7 +6843,7 @@
           <w:color w:val="059669"/>
           <w:sz w:val="18"/>
         </w:rPr>
-        <w:t>+36%</w:t>
+        <w:t>+41%</w:t>
       </w:r>
     </w:p>
     <w:p>
@@ -6848,7 +6862,7 @@
               <a:graphicData uri="http://schemas.openxmlformats.org/drawingml/2006/picture">
                 <pic:pic>
                   <pic:nvPicPr>
-                    <pic:cNvPr id="0" name="chart_radar_INS_002.png"/>
+                    <pic:cNvPr id="0" name="chart_radar_INS_001.png"/>
                     <pic:cNvPicPr/>
                   </pic:nvPicPr>
                   <pic:blipFill>
@@ -6884,7 +6898,7 @@
           <w:color w:val="6B7280"/>
           <w:sz w:val="18"/>
         </w:rPr>
-        <w:t>Score Breakdown: Natural &amp; Herbal Hair Colour</w:t>
+        <w:t>Score Breakdown: Grey Hair Coverage &amp; Root Touch-Up</w:t>
       </w:r>
     </w:p>
     <w:p>
@@ -6913,7 +6927,7 @@
           <w:i w:val="0"/>
           <w:sz w:val="22"/>
         </w:rPr>
-        <w:t>954 consumer mentions (10.6% prevalence) express strong interest in natural, herbal, and chemical-free hair colouring. Henna and mehendi dominate this conversation, with consumers sharing DIY recipes mixing amla, indigo, beetroot, and other botanicals. Indian consumers show particularly high awareness of traditional dyeing methods passed down through generations.</w:t>
+        <w:t>Grey Hair Coverage &amp; Root Touch-Up is the third-largest theme at 937 items (10.4% prevalence) with strongly positive sentiment (475 positive, 95 negative, 325 neutral, 42 mixed; NSS +40.6%). Conversations span all five platforms, blending product reviews with emotionally charged discussions about ageing and premature greying.</w:t>
       </w:r>
     </w:p>
     <w:p>
@@ -6942,7 +6956,7 @@
           <w:i w:val="0"/>
           <w:sz w:val="22"/>
         </w:rPr>
-        <w:t>The natural hair colour preference is driven by a dual fear - fear of chemical damage from synthetic dyes AND a cultural confidence in ayurvedic and traditional Indian remedies. Consumers are not just choosing natural for safety but asserting a cultural identity that values traditional knowledge over Western cosmetic chemistry.</w:t>
+        <w:t>Grey coverage is not a cosmetic preference - it is an anxiety management ritual. Consumers frame greying as a loss of control over how they are perceived socially and professionally. The high positive sentiment reflects relief when a product successfully restores a sense of youthfulness, not satisfaction with the product per se. This explains why consumers tolerate imperfect formulations (smell, texture, mess) if the coverage result is convincing - the emotional payoff outweighs the functional friction.</w:t>
       </w:r>
     </w:p>
     <w:p>
@@ -6971,7 +6985,7 @@
           <w:i w:val="0"/>
           <w:sz w:val="22"/>
         </w:rPr>
-        <w:t>There is a significant white space for brands that can bridge traditional Indian hair care wisdom with modern product convenience. The market is currently split between pure henna (authentic but messy and limited in shades) and branded herbal products (convenient but distrusted for containing hidden chemicals).</w:t>
+        <w:t>Brands that position grey coverage products purely on functional claims (percentage coverage, lasting power) miss the emotional core of the purchase decision. The opportunity is in owning the emotional territory of 'confidence restored' rather than competing on coverage percentages where differentiation is minimal. Conversely, any product failure in grey coverage carries disproportionate emotional weight - it is not just a bad product experience but a failed anxiety remedy.</w:t>
       </w:r>
     </w:p>
     <w:p>
@@ -7000,7 +7014,7 @@
           <w:i w:val="0"/>
           <w:sz w:val="22"/>
         </w:rPr>
-        <w:t>Launch a herbal hair colour range that explicitly names every ingredient with its ayurvedic purpose, uses transparent packaging, and offers application convenience comparable to synthetic dyes. Partner with ayurvedic practitioners or dermatologists to validate claims.</w:t>
+        <w:t>Develop a dedicated grey coverage sub-brand or product line with messaging centred on confidence and self-assurance rather than technical coverage claims. Launch a 'Root Confidence' campaign featuring real consumers (not models) discussing the emotional before-and-after, distributed via YouTube pre-roll and Instagram Reels targeting women 30-50. Include a 'satisfaction guarantee' specific to grey coverage products to reduce purchase anxiety.</w:t>
       </w:r>
     </w:p>
     <w:p>
@@ -7029,7 +7043,7 @@
           <w:i w:val="0"/>
           <w:sz w:val="22"/>
         </w:rPr>
-        <w:t>Test the concept of a transparent-ingredient herbal hair colour line with Indian women aged 30-55 through concept testing. Measure whether certification from an ayurvedic body increases purchase intent.</w:t>
+        <w:t>Conduct a quantitative survey (n=500, women 25-55 who colour grey hair, stratified by metro/non-metro India) testing the relative importance of emotional benefits (confidence, youthfulness, social perception) vs. functional benefits (coverage %, longevity, ease) in hair colour purchase decisions. Specific question: 'When your grey coverage product works well, what is the primary feeling you experience?' with forced-choice options spanning functional satisfaction to emotional relief.</w:t>
       </w:r>
     </w:p>
     <w:p>
@@ -7060,7 +7074,7 @@
           <w:color w:val="374151"/>
           <w:sz w:val="20"/>
         </w:rPr>
-        <w:t>"Natural Color: Color looks natural, covered greys fully, no strong smell, hair feels soft after use, easy instructions, lasted weeks well enough."</w:t>
+        <w:t>"I’m 46 and have decided to just go grey naturally. I haven’t dyed my hair in years and it’s just so much healthier now. Fingers crossed I look as cool as her later (I only have a few strands of white for now)!"</w:t>
       </w:r>
       <w:r>
         <w:rPr>
@@ -7070,7 +7084,7 @@
           <w:color w:val="6B7280"/>
           <w:sz w:val="18"/>
         </w:rPr>
-        <w:t xml:space="preserve">  - amazon</w:t>
+        <w:t xml:space="preserve">  - youtube</w:t>
       </w:r>
     </w:p>
     <w:p>
@@ -7086,7 +7100,7 @@
           <w:color w:val="374151"/>
           <w:sz w:val="20"/>
         </w:rPr>
-        <w:t>"Clear skin सपोर्ट हेतु Planet Ayurveda का Gleaming Skin Hair Nails Formula Capsules त्वचा पोषण में सहायक है।"</w:t>
+        <w:t>"Need to improve a bit: Pros - Good coverage for short Greys. Cons - The black crayon falls off from the tube easily so you have to be very careful while opening the tube. Secondly, it is not transfer-proof. The colour will transfer to your fingers if you touch it after applying."</w:t>
       </w:r>
       <w:r>
         <w:rPr>
@@ -7096,7 +7110,7 @@
           <w:color w:val="6B7280"/>
           <w:sz w:val="18"/>
         </w:rPr>
-        <w:t xml:space="preserve">  - youtube</w:t>
+        <w:t xml:space="preserve">  - amazon</w:t>
       </w:r>
     </w:p>
     <w:p>
@@ -7112,7 +7126,7 @@
           <w:color w:val="374151"/>
           <w:sz w:val="20"/>
         </w:rPr>
-        <w:t>"@code_mom_ @stardewy_ I have always done box dyes, and the only time I ever have color issues is when going from blonde to a non-natural color. I've never gotten green or grey unintentionally when going from blonde to brown, and I've done it quite a few times without issue."</w:t>
+        <w:t>"@GoalLoaded If you want to hide your grey hairs try this hair fiber powder https://t.co/8ylXvVnFPT"</w:t>
       </w:r>
       <w:r>
         <w:rPr>
@@ -7145,7 +7159,7 @@
           <w:color w:val="1E3A5F"/>
           <w:sz w:val="32"/>
         </w:rPr>
-        <w:t>05. Grey Hair Coverage &amp; Root Touch-Up</w:t>
+        <w:t>05. Product Format Innovation</w:t>
       </w:r>
     </w:p>
     <w:p>
@@ -7160,7 +7174,7 @@
           <w:color w:val="6B7280"/>
           <w:sz w:val="18"/>
         </w:rPr>
-        <w:t>n=937</w:t>
+        <w:t>n=1348</w:t>
       </w:r>
       <w:r>
         <w:rPr>
@@ -7200,7 +7214,7 @@
           <w:color w:val="374151"/>
           <w:sz w:val="18"/>
         </w:rPr>
-        <w:t>58% (Moderate)</w:t>
+        <w:t>57% (Moderate)</w:t>
       </w:r>
       <w:r>
         <w:rPr>
@@ -7210,7 +7224,7 @@
           <w:color w:val="6B7280"/>
           <w:sz w:val="18"/>
         </w:rPr>
-        <w:t xml:space="preserve">  |  10.4% of Dataset</w:t>
+        <w:t xml:space="preserve">  |  15.0% of Dataset</w:t>
       </w:r>
       <w:r>
         <w:rPr>
@@ -7230,7 +7244,7 @@
           <w:color w:val="059669"/>
           <w:sz w:val="18"/>
         </w:rPr>
-        <w:t>+41%</w:t>
+        <w:t>+24%</w:t>
       </w:r>
     </w:p>
     <w:p>
@@ -7249,7 +7263,7 @@
               <a:graphicData uri="http://schemas.openxmlformats.org/drawingml/2006/picture">
                 <pic:pic>
                   <pic:nvPicPr>
-                    <pic:cNvPr id="0" name="chart_radar_INS_001.png"/>
+                    <pic:cNvPr id="0" name="chart_radar_INS_014.png"/>
                     <pic:cNvPicPr/>
                   </pic:nvPicPr>
                   <pic:blipFill>
@@ -7285,7 +7299,7 @@
           <w:color w:val="6B7280"/>
           <w:sz w:val="18"/>
         </w:rPr>
-        <w:t>Score Breakdown: Grey Hair Coverage &amp; Root Touch-Up</w:t>
+        <w:t>Score Breakdown: Product Format Innovation</w:t>
       </w:r>
     </w:p>
     <w:p>
@@ -7314,7 +7328,7 @@
           <w:i w:val="0"/>
           <w:sz w:val="22"/>
         </w:rPr>
-        <w:t>937 consumer mentions (10.4% prevalence) across all 5 platforms discuss grey hair coverage as a primary need. Premature greying in the 20s-30s is a recurring concern among Indian consumers, with conversations spanning product reviews of instant grey cover solutions, emotional discussions about ageing acceptance, and root touch-up routines. NSS of +0.18 indicates mild positive sentiment, with significant negative experiences around incomplete coverage and colour fading after washes.</w:t>
+        <w:t>Product Format Innovation has 1,348 items (15.0% prevalence) with moderately positive sentiment (428 positive, 111 negative, 758 neutral, 51 mixed; NSS +23.5%). Discussions cover foam dyes, shampoo colours, hair chalk, colour wax, spray colours, and colour sticks across all five platforms.</w:t>
       </w:r>
     </w:p>
     <w:p>
@@ -7343,7 +7357,7 @@
           <w:i w:val="0"/>
           <w:sz w:val="22"/>
         </w:rPr>
-        <w:t>Grey coverage is not just a cosmetic need but an emotional one - consumers associate visible grey hair with premature ageing and social judgement, creating urgency that drives impulse purchases of quick-fix solutions. The tension between wanting to cover grey and fearing chemical damage creates a market for ammonia-free, natural grey coverage products.</w:t>
+        <w:t>Format innovation is the category's primary growth lever, but consumers evaluate new formats through an ease-of-use lens rather than a novelty lens. The 758 neutral items (56% of theme) are product discovery and exploration content - consumers encountering new formats and seeking information about how they work. The 111 negative items cluster around formats that promised ease but delivered complexity (foam dyes that drip, shampoo colours that stain hands, chalk that transfers). The core consumer demand is not 'I want something new' but 'I want something that requires less skill than traditional dye.' Format innovation succeeds when it lowers the skill barrier; it fails when novelty creates new skill requirements.</w:t>
       </w:r>
     </w:p>
     <w:p>
@@ -7372,7 +7386,7 @@
           <w:i w:val="0"/>
           <w:sz w:val="22"/>
         </w:rPr>
-        <w:t>The grey coverage segment represents a high-frequency, repeat-purchase opportunity with strong emotional drivers. Consumers cycle through products quickly because no solution fully satisfies the triangle of coverage quality, hair safety, and longevity.</w:t>
+        <w:t>R&amp;D investment in format innovation should be prioritised by skill-barrier reduction rather than by technological novelty. A format that eliminates one application step (e.g., no mixing, no timing, no gloves needed) will outperform a format that adds a new capability (e.g., multi-tonal colour) but maintains complexity. The 758 neutral discovery items represent a segment actively evaluating whether to switch from traditional formats - their conversion depends on whether new formats demonstrably reduce effort.</w:t>
       </w:r>
     </w:p>
     <w:p>
@@ -7401,7 +7415,7 @@
           <w:i w:val="0"/>
           <w:sz w:val="22"/>
         </w:rPr>
-        <w:t>Develop a grey coverage sub-line with three distinct promises: instant touch-up (powder/spray for daily use), gentle full coverage (ammonia-free cream for monthly use), and progressive coverage (shampoo-based for gradual darkening). Each product should clearly communicate its duration and safety profile.</w:t>
+        <w:t>Redesign the format innovation pipeline around skill-barrier testing: (1) Before launching any new format, conduct usability testing with first-time users (not product testers) and measure application success rate, time to completion, and mess created. Only launch formats with &gt;80% first-attempt success rate. (2) Reposition existing easy formats (shampoo colour, colour wax) with 'zero skill required' messaging and demo videos showing first-time application. (3) Develop a 'mess-free' product line with integrated applicators that eliminate gloves, mixing bowls, and brushes - the mess factor is a consistent barrier across 3,730+ DIY items (THM_04) and 52 staining items (THM_16). (4) Create a format comparison guide on the brand website helping consumers self-select the right format for their skill level.</w:t>
       </w:r>
     </w:p>
     <w:p>
@@ -7430,7 +7444,7 @@
           <w:i w:val="0"/>
           <w:sz w:val="22"/>
         </w:rPr>
-        <w:t>Conduct a quantitative survey among Indian consumers aged 25-45 to measure the relative importance of coverage completeness vs. hair safety vs. longevity.</w:t>
+        <w:t>Conduct a comparative usability study (n=60, 20 per format - traditional dye, foam, shampoo colour - first-time users only) measuring task completion rate, time, satisfaction, and willingness to repurchase. Record sessions to identify specific failure points per format. Key question: 'Could a first-time user achieve an acceptable result without watching a tutorial?'</w:t>
       </w:r>
     </w:p>
     <w:p>
@@ -7461,7 +7475,7 @@
           <w:color w:val="374151"/>
           <w:sz w:val="20"/>
         </w:rPr>
-        <w:t>"I’m 46 and have decided to just go grey naturally. I haven’t dyed my hair in years and it’s just so much healthier now. Fingers crossed I look as cool as her later (I only have a few strands of white for now)!"</w:t>
+        <w:t>"Instant hair color: Fantastically color the hair without putting any effort loving this"</w:t>
       </w:r>
       <w:r>
         <w:rPr>
@@ -7471,7 +7485,7 @@
           <w:color w:val="6B7280"/>
           <w:sz w:val="18"/>
         </w:rPr>
-        <w:t xml:space="preserve">  - youtube</w:t>
+        <w:t xml:space="preserve">  - amazon</w:t>
       </w:r>
     </w:p>
     <w:p>
@@ -7487,7 +7501,7 @@
           <w:color w:val="374151"/>
           <w:sz w:val="20"/>
         </w:rPr>
-        <w:t>"Need to improve a bit: Pros - Good coverage for short Greys. Cons - The black crayon falls off from the tube easily so you have to be very careful while opening the tube. Secondly, it is not transfer-proof. The colour will transfer to your fingers if you touch it after applying."</w:t>
+        <w:t>"Not true, my son has texture powder clay and sea salt spray spray and clay the only thing that holds his hair"</w:t>
       </w:r>
       <w:r>
         <w:rPr>
@@ -7497,7 +7511,7 @@
           <w:color w:val="6B7280"/>
           <w:sz w:val="18"/>
         </w:rPr>
-        <w:t xml:space="preserve">  - amazon</w:t>
+        <w:t xml:space="preserve">  - youtube</w:t>
       </w:r>
     </w:p>
     <w:p>
@@ -7513,7 +7527,7 @@
           <w:color w:val="374151"/>
           <w:sz w:val="20"/>
         </w:rPr>
-        <w:t>"@GoalLoaded If you want to hide your grey hairs try this hair fiber powder https://t.co/8ylXvVnFPT"</w:t>
+        <w:t>"@MvpRoaring I know about hair color and it's chemicals. I have had blue hair before. But whatever it's applied on hair was thru spray form which is not ideal hair color application whether it's permanent or temp"</w:t>
       </w:r>
       <w:r>
         <w:rPr>
@@ -7715,7 +7729,7 @@
           <w:i w:val="0"/>
           <w:sz w:val="22"/>
         </w:rPr>
-        <w:t>1,333 consumer mentions (14.9% prevalence) discuss colour longevity - how long it lasts, fading patterns, and maintenance. The distinction between permanent, semi-permanent, and temporary colour is a major source of confusion. Amazon reviews frequently complain about colour washing out after 2-3 washes despite product claims.</w:t>
+        <w:t>Colour Longevity &amp; Fading has 1,333 items (14.9% prevalence) with moderately positive sentiment (495 positive, 203 negative, 554 neutral, 81 mixed; NSS +21.9%). Discussion spans temporary vs. permanent vs. semi-permanent distinctions, wash-out behaviour, and colour retention across all five platforms.</w:t>
       </w:r>
     </w:p>
     <w:p>
@@ -7744,7 +7758,7 @@
           <w:i w:val="0"/>
           <w:sz w:val="22"/>
         </w:rPr>
-        <w:t>Colour longevity is the most common source of post-purchase disappointment. The gap between marketing claims and actual performance is wider in India's climate - heat, humidity, and frequent hair oiling accelerate fading in ways that products designed for Western conditions do not account for.</w:t>
+        <w:t>Longevity dissatisfaction is primarily an expectations-setting failure rather than a formulation failure. Consumers operate with a binary mental model - 'it works' or 'it fades' - without understanding the designed behaviour differences between temporary, semi-permanent, and permanent formulations. The 203 negative mentions are concentrated among consumers who purchased temporary or semi-permanent products expecting permanent results, or permanent products expecting salon-equivalent longevity without salon-equivalent aftercare. The product performed as designed but failed against the consumer's uninformed expectations.</w:t>
       </w:r>
     </w:p>
     <w:p>
@@ -7773,7 +7787,7 @@
           <w:i w:val="0"/>
           <w:sz w:val="22"/>
         </w:rPr>
-        <w:t>Longevity claims are a credibility minefield. Overpromising on duration erodes brand trust faster than any other factor. There is an opportunity for honest, condition-specific longevity guidance.</w:t>
+        <w:t>Every longevity complaint that stems from expectations mismatch is a preventable negative review. In e-commerce environments where star ratings drive purchase, these preventable complaints directly erode conversion. The strategic opportunity is to shift from defending longevity claims to proactively educating on the longevity spectrum before purchase - turning a source of complaints into a differentiation axis where the brand demonstrates superior transparency.</w:t>
       </w:r>
     </w:p>
     <w:p>
@@ -7802,7 +7816,7 @@
           <w:i w:val="0"/>
           <w:sz w:val="22"/>
         </w:rPr>
-        <w:t>Replace generic longevity claims with a conditional promise system - a Colour Duration Calculator that estimates fade timeline based on wash frequency, water type, and hair oiling habits. Develop a colour-lock post-wash serum.</w:t>
+        <w:t>Implement a 'Longevity Expectation System' across all touchpoints: (1) Add a clear visual longevity scale on packaging and e-commerce listings showing expected washes/weeks for each product tier. (2) Create comparison content ('Temporary vs Semi-Permanent vs Permanent - Which Is Right For You?') for YouTube and blog SEO targeting high-intent search queries. (3) Add post-purchase SMS/WhatsApp aftercare tips at Day 1, Week 1, and Week 3 after purchase (via e-commerce order data) that set realistic expectations and extend perceived longevity through care advice. (4) Train e-commerce customer service to proactively categorise longevity complaints as expectations-related vs. formulation-related for product development feedback.</w:t>
       </w:r>
     </w:p>
     <w:p>
@@ -7831,7 +7845,7 @@
           <w:i w:val="0"/>
           <w:sz w:val="22"/>
         </w:rPr>
-        <w:t>Commission a controlled longevity study testing top-selling Indian hair colours under Indian conditions - hard water, coconut oil pre-wash, high humidity.</w:t>
+        <w:t>Run a controlled experiment (n=200, random assignment to 'standard packaging' vs. 'longevity-educated packaging' with clear duration expectations) measuring post-use satisfaction scores and likelihood of leaving a negative review. Specific hypothesis: explicit longevity education reduces negative reviews attributable to fading by at least 30%.</w:t>
       </w:r>
     </w:p>
     <w:p>
@@ -8116,7 +8130,7 @@
           <w:i w:val="0"/>
           <w:sz w:val="22"/>
         </w:rPr>
-        <w:t>915 consumer mentions (10.2% prevalence) discuss trend-driven colour choices influenced by celebrities, K-pop, social media, and fashion. Unconventional colours (pink, blue, purple, silver, teal) drive excitement and social sharing. K-pop influence is notable.</w:t>
+        <w:t>Trending Colours &amp; Fashion Influence has 915 items (10.2% prevalence) with moderately positive sentiment (274 positive, 89 negative, 524 neutral, 28 mixed; NSS +20.2%). The high neutral count (57% of items) and coverage across all five platforms suggests this theme is dominated by aspirational browsing and trend-watching rather than purchase-related discussion.</w:t>
       </w:r>
     </w:p>
     <w:p>
@@ -8145,7 +8159,7 @@
           <w:i w:val="0"/>
           <w:sz w:val="22"/>
         </w:rPr>
-        <w:t>The trending colours conversation is aspirational rather than actionable - consumers share excitement about bold colours online but most do not actually dye their hair these shades. Indian dark hair requires bleaching for most fashion colours, creating a damage barrier. Temporary and washable colour products are the bridge products that convert trend interest into usage.</w:t>
+        <w:t>The trend colour conversation in India has a large aspiration-action gap. The 524 neutral items are predominantly consumers sharing, saving, and discussing trendy colours (pinks, blues, purples, silver, K-pop-inspired shades) without converting to purchase. This browsing behaviour functions as entertainment and identity signalling ('I have trendy taste') rather than purchase intent. The 89 negative mentions likely reflect consumers who attempted unconventional colours and experienced disappointment with results on dark Indian hair - a formulation challenge where most global trend colours are designed for pre-bleached light hair. The aspiration exists; the product-market fit does not.</w:t>
       </w:r>
     </w:p>
     <w:p>
@@ -8174,7 +8188,7 @@
           <w:i w:val="0"/>
           <w:sz w:val="22"/>
         </w:rPr>
-        <w:t>The trending colours segment is high-engagement, low-conversion. The opportunity is in temporary, no-commitment colour products that let consumers participate in trends without risking hair damage.</w:t>
+        <w:t>The trend colour segment represents a future growth vector as India's Gen Z comes of age with more permissive attitudes toward unconventional hair colour. Brands that solve the dark-hair formulation challenge now build early loyalty with a demographic that will colour their hair for 30+ years. Ignoring this segment cedes it to international brands (Manic Panic, Arctic Fox) that may enter the Indian market with existing trend credibility but poor India-specific formulation.</w:t>
       </w:r>
     </w:p>
     <w:p>
@@ -8203,7 +8217,7 @@
           <w:i w:val="0"/>
           <w:sz w:val="22"/>
         </w:rPr>
-        <w:t>Expand the temporary colour product range - washable sprays, colour wax, colour-depositing masks. Launch limited-edition trend colours tied to cultural moments (festivals, Bollywood releases, K-pop tours).</w:t>
+        <w:t>Address the aspiration-action gap with India-specific trend colour formulations: (1) Develop a 'Trend Lab' limited-edition line with 4-6 fashion colours specifically formulated for dark hair without requiring bleaching - position as the brand that 'makes trends work for Indian hair.' (2) Launch a quarterly 'Trending Now' social media campaign on Instagram and YouTube featuring Indian creators with diverse hair textures wearing the latest global colour trends, achieved with the brand's products. (3) Create a temporary/washable trend colour line (colour sprays, chalk, wax) as a low-commitment entry point for trend-curious consumers - this converts the 524 neutral browsers into trial users. (4) Partner with 2-3 K-pop or Bollywood fan communities for limited-edition shade releases tied to cultural moments.</w:t>
       </w:r>
     </w:p>
     <w:p>
@@ -8232,7 +8246,7 @@
           <w:i w:val="0"/>
           <w:sz w:val="22"/>
         </w:rPr>
-        <w:t>Track the conversion rate from trend colour social media engagement to actual purchase. Test whether trial-size temporary colour products drive subsequent full-size purchase.</w:t>
+        <w:t>Run a concept test (n=300, Gen Z and Millennials 18-30, online survey with product concept visuals) measuring purchase intent for a 'trend colour for dark hair' product line vs. existing options. Include a price sensitivity component. Specific question: 'If a brand offered fashion colours that worked on your natural dark hair without bleaching, how likely would you be to try it, and how much would you pay?'</w:t>
       </w:r>
     </w:p>
     <w:p>
@@ -8517,7 +8531,7 @@
           <w:i w:val="0"/>
           <w:sz w:val="22"/>
         </w:rPr>
-        <w:t>684 consumer mentions (7.6% prevalence) discuss price sensitivity, salon vs home cost comparisons, and value-for-money assessments. Deal-seeking behaviour is prominent, with Twitter threads sharing discount codes and sale prices.</w:t>
+        <w:t>Value &amp; Affordability has 684 items (7.6% prevalence) with positive sentiment (397 positive, 90 negative, 169 neutral, 28 mixed; NSS +44.9%). Discussions span price sensitivity, salon vs. home cost comparisons, and value-for-money assessments across all five platforms.</w:t>
       </w:r>
     </w:p>
     <w:p>
@@ -8546,7 +8560,7 @@
           <w:i w:val="0"/>
           <w:sz w:val="22"/>
         </w:rPr>
-        <w:t>Price is not the primary purchase driver - value perception is. Consumers mentally calculate a cost-per-use metric, comparing price against longevity and coverage quality. A Rs 500 product lasting 6 weeks is perceived as better value than a Rs 100 product fading in 3 days.</w:t>
+        <w:t>Price discussion in hair colour is not about absolute affordability - it is about cost-per-use justification. The high positive NSS (+44.9%) indicates that consumers who discuss price are largely satisfied with the value proposition, suggesting current price points are acceptable. The 90 negative mentions cluster around two distinct segments: (1) consumers comparing home colour cost to salon cost and finding the gap insufficient to justify DIY hassle, and (2) consumers comparing Indian brands to international brands and questioning the premium. The value equation is not 'is this affordable' but 'is the effort-to-savings ratio worth it compared to my alternatives.'</w:t>
       </w:r>
     </w:p>
     <w:p>
@@ -8575,7 +8589,7 @@
           <w:i w:val="0"/>
           <w:sz w:val="22"/>
         </w:rPr>
-        <w:t>Pricing strategy should be communicated through a value-per-use framework rather than absolute price points. The Rs 40-100 sachet format is winning on accessibility, not value perception.</w:t>
+        <w:t>Price competition in hair colour is a race to the bottom that erodes margins without expanding the category. The insight that value is judged against effort-savings ratio means brands can increase perceived value by reducing application effort (simpler formats, less mess, faster processing) rather than by cutting price. The 397 positive mentions indicate a satisfied value segment that should not be disrupted with unnecessary price promotions.</w:t>
       </w:r>
     </w:p>
     <w:p>
@@ -8604,7 +8618,7 @@
           <w:i w:val="0"/>
           <w:sz w:val="22"/>
         </w:rPr>
-        <w:t>Reframe pricing around cost-per-week. Create bundle offers including aftercare products to increase basket size while improving perceived value.</w:t>
+        <w:t>Shift value communication from price-per-box to cost-per-use: (1) Add 'applications per box' prominently on packaging and e-commerce listings. (2) Create comparison content showing cost-per-colour-session at home vs. salon for specific metro cities (Mumbai, Delhi, Bangalore) with real salon price benchmarks. (3) Introduce multi-pack value bundles for loyal users who colour monthly (3-pack and 6-pack subscription options on e-commerce platforms). (4) For premium lines, emphasise time saved and professional-quality results rather than absolute price - the effort-to-savings ratio matters more than the price point.</w:t>
       </w:r>
     </w:p>
     <w:p>
@@ -8633,7 +8647,7 @@
           <w:i w:val="0"/>
           <w:sz w:val="22"/>
         </w:rPr>
-        <w:t>Conduct a price sensitivity analysis for the top 3 product formats in the Indian market.</w:t>
+        <w:t>Run a price sensitivity analysis (Van Westendorp's Price Sensitivity Meter, n=300, active home hair colour users across income segments and metro/non-metro) to identify the optimal price point and the price thresholds at which consumers switch to salon visits or downgrade brands. Specific question: 'At what price point would home hair colour no longer be worth the effort compared to going to a salon?'</w:t>
       </w:r>
     </w:p>
     <w:p>
@@ -8921,7 +8935,7 @@
           <w:i w:val="0"/>
           <w:sz w:val="22"/>
         </w:rPr>
-        <w:t>705 consumer mentions (7.9% prevalence) compare brands, recommend products, and discuss switching experiences. Key brands: Garnier, L'Oreal, Paradyes, Godrej, Streax, Bigen, Nisha, Kokila, BBlunt, Indica. Reddit and Amazon are primary comparison platforms.</w:t>
+        <w:t>Brand Comparisons &amp; Recommendations contains 705 items (7.9% prevalence) with positive sentiment (324 positive, 58 negative, 293 neutral, 30 mixed; NSS +37.7%). Key brands discussed include Godrej, Garnier, L'Oreal, Streax, Paradyes, Bigen, Nisha, Kokila, BBlunt, and Indica across all five platforms.</w:t>
       </w:r>
     </w:p>
     <w:p>
@@ -8950,7 +8964,7 @@
           <w:i w:val="0"/>
           <w:sz w:val="22"/>
         </w:rPr>
-        <w:t>Brand loyalty in Indian hair colour is remarkably low - consumers frequently switch based on specific shade needs, price promotions, or a single negative experience. No single brand owns a clear positioning in the Indian consumer's mind.</w:t>
+        <w:t>Brand comparisons in Indian hair colour are not structured around product attributes - they follow a social proof hierarchy. Consumers recommend brands based on who else uses them (family members, friends, influencers) rather than ingredient lists or clinical evidence. The high neutral count (293 of 705) reflects comparison-shopping behaviour where consumers are actively soliciting recommendations, not evaluating products. This peer-recommendation dynamic means brand equity in this category is built through social networks rather than advertising reach. A brand recommended by a consumer's mother or sister carries more weight than any celebrity endorsement.</w:t>
       </w:r>
     </w:p>
     <w:p>
@@ -8979,7 +8993,7 @@
           <w:i w:val="0"/>
           <w:sz w:val="22"/>
         </w:rPr>
-        <w:t>The Indian hair colour market is ripe for positioning disruption. Brand equity is shallow - consumers make decisions based on specific product attributes rather than brand halo.</w:t>
+        <w:t>Traditional advertising ROI models undervalue word-of-mouth in this category. The 324 positive brand mentions represent organic advocates whose influence extends far beyond the individual post - each recommendation potentially influences a family network's brand choice for years. Brands that invest in creating recommendable experiences (not just satisfactory ones) capture this network effect. The risk for challenger brands is that incumbent brands (Godrej, Garnier) have multi-generational recommendation moats that cannot be broken with advertising spend alone.</w:t>
       </w:r>
     </w:p>
     <w:p>
@@ -9008,7 +9022,7 @@
           <w:i w:val="0"/>
           <w:sz w:val="22"/>
         </w:rPr>
-        <w:t>Identify the single most defensible claim in the market and invest marketing budget in owning it rather than spreading across multiple messages.</w:t>
+        <w:t>Build a structured advocacy programme: (1) Launch a referral programme offering a free sample when a current user shares a personalised recommendation link with family or friends. (2) Create 'Mother-Daughter' and 'Family Colour Day' content for YouTube and Instagram that taps the intergenerational recommendation dynamic. (3) Seed product with 500 mid-tier micro-influencers (10K-100K followers) in Tier 2 and Tier 3 Indian cities where brand preferences are less entrenched. (4) Monitor brand comparison queries on Reddit, YouTube, and Quora and deploy community managers to provide helpful (non-promotional) responses within 24 hours.</w:t>
       </w:r>
     </w:p>
     <w:p>
@@ -9037,7 +9051,7 @@
           <w:i w:val="0"/>
           <w:sz w:val="22"/>
         </w:rPr>
-        <w:t>Commission a brand perception study mapping all major hair colour brands in India on key attributes: safety, shade range, longevity, value, naturalness, and convenience.</w:t>
+        <w:t>Conduct a social network analysis study (n=200 households, survey all adult members who colour hair about brand choice, recommendation source, and switching history) to map the intergenerational brand recommendation chains. Key question: 'Who first recommended the hair colour brand you currently use, and when?' to quantify the family influence effect and identify the primary recommendation source (mother, sister, friend, influencer, advertisement).</w:t>
       </w:r>
     </w:p>
     <w:p>
@@ -9322,7 +9336,7 @@
           <w:i w:val="0"/>
           <w:sz w:val="22"/>
         </w:rPr>
-        <w:t>484 consumer mentions (5.4% prevalence) compare professional salon colouring with at-home DIY. Salon prices are a major pain point, with consumers noting rapid price inflation. Reddit discussions reveal consumers switching from salon to home colouring to save money.</w:t>
+        <w:t>Salon vs Home Colouring Debate has 484 items (5.4% prevalence) with positive sentiment (266 positive, 57 negative, 121 neutral, 40 mixed; NSS +43.2%). The debate spans quality, cost, expertise, and convenience trade-offs across all five platforms.</w:t>
       </w:r>
     </w:p>
     <w:p>
@@ -9351,7 +9365,7 @@
           <w:i w:val="0"/>
           <w:sz w:val="22"/>
         </w:rPr>
-        <w:t>The salon-to-home migration is driven not by preference but by salon price inflation outpacing budgets. Consumers who switch express it as a compromise rather than a choice - they would prefer salon quality but cannot justify the cost for routine grey maintenance.</w:t>
+        <w:t>The salon vs. home debate is not a product competition - it is a confidence threshold. Consumers who have mastered home colouring techniques speak positively about home products and dismiss salon costs; consumers who lack confidence frame salon visits as insurance against failure. The 40 mixed-sentiment items (8.3% of theme) are disproportionately high compared to the corpus average, indicating genuine ambivalence rather than settled opinion. This suggests a segment of consumers who oscillate between channels depending on the occasion - salon for visible events (weddings, festivals), home for routine maintenance. These dual-channel consumers represent the highest lifetime value in the category because they purchase both professional and retail products.</w:t>
       </w:r>
     </w:p>
     <w:p>
@@ -9380,7 +9394,7 @@
           <w:i w:val="0"/>
           <w:sz w:val="22"/>
         </w:rPr>
-        <w:t>The home colouring market is expanding through reluctant salon defectors with higher quality expectations than traditional home colour users. Products bridging the quality gap will capture this segment.</w:t>
+        <w:t>Brands that position home colour as 'just as good as salon' create an adversarial relationship with salon professionals who are key influencers. The strategic opportunity is to design for the dual-channel consumer - helping them get salon-quality results at home for maintenance while acknowledging that salon visits serve a different emotional need (pampering, expertise, occasion preparation). Brands that serve both channels capture a larger share of the consumer's total colour spend.</w:t>
       </w:r>
     </w:p>
     <w:p>
@@ -9409,7 +9423,7 @@
           <w:i w:val="0"/>
           <w:sz w:val="22"/>
         </w:rPr>
-        <w:t>Launch a salon-grade home colour line with professional formulations simplified for consumer application. Include video tutorial access with each purchase.</w:t>
+        <w:t>Launch a 'Between Salon Visits' product positioning for a select product range: (1) Partner with salon chains (Naturals, VLCC, Jawed Habib) to create co-branded root touch-up kits sold at salon reception desks for use between appointments. (2) Develop a salon-recommended home maintenance guide included with salon colour services, branded to the at-home product line. (3) Create YouTube content featuring salon professionals teaching at-home techniques - bridging rather than competing with the salon channel. (4) Introduce a 'Salon Match' shade finder that helps consumers buy the at-home product matching their salon shade formula.</w:t>
       </w:r>
     </w:p>
     <w:p>
@@ -9438,7 +9452,7 @@
           <w:i w:val="0"/>
           <w:sz w:val="22"/>
         </w:rPr>
-        <w:t>Survey recent salon-to-home switchers to identify the specific quality dimensions they miss most from salon colouring.</w:t>
+        <w:t>Conduct a purchase diary study (n=100 women who use both salon and home colour, 6-month diary tracking each colour occasion) to map the decision triggers for choosing salon vs. home. Key question: 'For each colouring occasion, what made you choose salon vs. home, and how satisfied were you with the result relative to expectation?'</w:t>
       </w:r>
     </w:p>
     <w:p>
@@ -9723,7 +9737,7 @@
           <w:i w:val="0"/>
           <w:sz w:val="22"/>
         </w:rPr>
-        <w:t>753 consumer mentions (8.4% prevalence) discuss safety worries about hair colour products - allergic reactions, scalp irritation, PPD sensitivity, ammonia damage, hair fall, and long-term health effects. Amazon reviews frequently report post-colouring hair fall and scalp burning. Fear is the dominant emotion in this theme.</w:t>
+        <w:t>Safety Concerns &amp; Chemical Sensitivity contains 753 items (8.4% prevalence) and is the only major theme with net negative sentiment (278 positive, 373 negative, 61 neutral, 41 mixed; NSS -12.6%). This theme is flagged as contested, with active disagreement across all five platforms about the health effects of chemical dyes, PPD sensitivity, and ammonia damage.</w:t>
       </w:r>
     </w:p>
     <w:p>
@@ -9752,7 +9766,7 @@
           <w:i w:val="0"/>
           <w:sz w:val="22"/>
         </w:rPr>
-        <w:t>Safety anxiety is the single biggest barrier to hair colour adoption and repeat purchase in India. Consumers who experience even one adverse reaction permanently switch to natural alternatives or stop colouring entirely. The Indian consumer's safety threshold is lower than Western markets because hair health is culturally central to beauty standards.</w:t>
+        <w:t>Safety concern in hair colour is not a single coherent fear - it is a spectrum ranging from clinically validated allergic reactions (PPD sensitivity, contact dermatitis) to unfounded anxieties (hair colour causing cancer, permanent scalp damage). Consumers cannot distinguish between these, and the contested nature of the conversation (negative NSS with active disagreement) suggests that misinformation and legitimate safety signals are entangled. The low neutral count (only 61 of 753) indicates this is a topic where consumers take strong positions rather than seeking balanced information - making it resistant to rational counter-messaging.</w:t>
       </w:r>
     </w:p>
     <w:p>
@@ -9781,7 +9795,7 @@
           <w:i w:val="0"/>
           <w:sz w:val="22"/>
         </w:rPr>
-        <w:t>Safety is not a feature - it is the foundation of brand trust in Indian hair colour. Consumer conversations reveal that safety reassurance drives the actual purchase decision. Brands with documented safety profiles will disproportionately benefit from word-of-mouth.</w:t>
+        <w:t>Brands face a dilemma: ignoring safety concerns cedes the narrative to alarmist voices, but engaging directly risks amplifying fears. The contested nature means any brand communication enters a polarised environment where it will be challenged. The strategic risk is that safety concerns migrate from a niche worry (8.4% of corpus) to a mainstream purchase barrier if amplified by media or regulatory attention. The 373 negative mentions represent potential category detractors who may discourage others from colouring entirely.</w:t>
       </w:r>
     </w:p>
     <w:p>
@@ -9810,7 +9824,7 @@
           <w:i w:val="0"/>
           <w:sz w:val="22"/>
         </w:rPr>
-        <w:t>Make safety the lead marketing message. Introduce a visible safety certification on packaging, include a free patch test kit in every box, and create a transparent adverse reaction reporting system.</w:t>
+        <w:t>Create a standalone safety resource hub (microsite + WhatsApp-shareable content) that addresses the top 5 safety concerns with dermatologist-backed evidence, clearly separating validated risks (patch test necessity, PPD allergy prevalence) from myths (permanent damage claims). Avoid placing this on the brand's main product pages where it could introduce doubt at point of purchase. Partner with 3-5 dermatologist influencers on Instagram and YouTube to create 'myth vs. fact' content. Implement mandatory patch test reminders in all packaging and digital touchpoints.</w:t>
       </w:r>
     </w:p>
     <w:p>
@@ -9839,7 +9853,7 @@
           <w:i w:val="0"/>
           <w:sz w:val="22"/>
         </w:rPr>
-        <w:t>Conduct a conjoint analysis to measure the trade-off Indian consumers make between shade variety, price, and safety credentials.</w:t>
+        <w:t>Commission a clinical evidence review (systematic literature review of hair dye adverse events in Indian populations, covering published studies 2015-2025) to establish the actual incidence rate of allergic reactions in the Indian market. Pair with a consumer survey (n=800, hair colour users and non-users) asking: 'Which of these health concerns about hair colour do you believe are true?' with a mix of validated and mythical claims, to quantify the misinformation gap.</w:t>
       </w:r>
     </w:p>
     <w:p>
@@ -10124,7 +10138,7 @@
           <w:i w:val="0"/>
           <w:sz w:val="22"/>
         </w:rPr>
-        <w:t>308 consumer mentions (3.4% prevalence) frame hair colouring as self-expression, personal transformation, and identity exploration. Consumers describe dyeing as marking fresh starts, boosting confidence, and expressing individuality. NSS of +0.35 shows the most positive sentiment of all themes.</w:t>
+        <w:t>Self-Expression &amp; Identity Through Hair Colour has 308 items (3.4% prevalence) with strongly positive sentiment (176 positive, 15 negative, 98 neutral, 19 mixed; NSS +52.3%). This is the second-highest NSS among all themes. The very low negative count (only 15 items) makes this the least contested theme in the corpus.</w:t>
       </w:r>
     </w:p>
     <w:p>
@@ -10153,7 +10167,7 @@
           <w:i w:val="0"/>
           <w:sz w:val="22"/>
         </w:rPr>
-        <w:t>A growing segment of Indian consumers has shifted from viewing hair colour as a grey-covering necessity to embracing it as a self-expression tool. This shift represents a fundamental market expansion - these consumers colour not because they need to but because they want to.</w:t>
+        <w:t>Self-expression through hair colour in India operates in a permission-seeking frame rather than an assertion frame. Unlike Western markets where bold hair colour is an act of individual rebellion, Indian consumers frame colour choices as seeking permission from their social context - workplace acceptability, family approval, peer validation. The 176 positive mentions are overwhelmingly about receiving compliments and validation post-colouring, not about the act of self-expression itself. This means the emotional reward is social approval for the transformation, not autonomous self-expression. The near-absence of negative sentiment (15 items) suggests consumers who face social disapproval simply do not colour rather than colour-and-regret.</w:t>
       </w:r>
     </w:p>
     <w:p>
@@ -10182,7 +10196,7 @@
           <w:i w:val="0"/>
           <w:sz w:val="22"/>
         </w:rPr>
-        <w:t>The self-expression segment is the fastest-growing and highest-margin opportunity, requiring completely different marketing than grey coverage. These consumers generate organic social content, making them disproportionately valuable as brand advocates.</w:t>
+        <w:t>Brands that import Western 'be bold, be you' messaging for the Indian market may be targeting an aspiration that consumers do not actually hold. The opportunity is not in encouraging rebellion but in normalising colour choices by providing social proof that specific shades are workplace-appropriate, family-approved, and occasion-suitable. This is a distinct positioning from both the grey coverage segment (anxiety-driven) and the trend segment (fashion-driven).</w:t>
       </w:r>
     </w:p>
     <w:p>
@@ -10211,7 +10225,7 @@
           <w:i w:val="0"/>
           <w:sz w:val="22"/>
         </w:rPr>
-        <w:t>Create a distinct product line for self-expression - bold packaging, trend-driven shade drops, collaborations with Indian content creators. Launch seasonal limited-edition shades.</w:t>
+        <w:t>Develop 'Colour Confidence' campaign content showing hair colour in socially validated Indian contexts: office presentations, family gatherings, festive occasions, and job interviews. Feature real consumers (not celebrities) in relatable settings receiving positive reactions. Create a shade recommendation engine organised by occasion and social context ('Professional Meetings', 'Wedding Season', 'College Life') rather than by colour spectrum. Deploy on Instagram and YouTube with testimonial-style content emphasising social validation received after colouring.</w:t>
       </w:r>
     </w:p>
     <w:p>
@@ -10240,7 +10254,7 @@
           <w:i w:val="0"/>
           <w:sz w:val="22"/>
         </w:rPr>
-        <w:t>Segment the Indian hair colour market by motivation (grey coverage vs. fashion) and quantify the size, growth rate, and average spend of each segment.</w:t>
+        <w:t>Conduct in-depth interviews (n=25, women 20-40 who have coloured their hair in the past year, across metros and Tier 2 cities) exploring the social negotiation process around hair colour decisions. Key question: 'Walk me through the conversation you had with family/friends/colleagues before and after your last hair colour change - what feedback did you receive and how did it affect your next choice?'</w:t>
       </w:r>
     </w:p>
     <w:p>
@@ -10528,7 +10542,7 @@
           <w:i w:val="0"/>
           <w:sz w:val="22"/>
         </w:rPr>
-        <w:t>348 consumer mentions (3.9% prevalence) discuss hair damage from colouring - bleach damage, breakage, dryness, hair fall after dyeing, and repair solutions. Consumers share cautionary tales of hair 'melting' from bleach and discuss Olaplex, bond repair, and deep conditioning treatments.</w:t>
+        <w:t>Post-Colour Hair Damage &amp; Repair has 348 items (3.9% prevalence) with the most divided sentiment of any non-contested theme (152 positive, 91 negative, 70 neutral, 35 mixed; NSS +17.5%). Flagged as contested, with the highest mixed proportion (10.1%) and low neutral proportion (20.1%) indicating active polarisation. Covers bleach damage, breakage, dryness, hair fall after dyeing, and repair solutions.</w:t>
       </w:r>
     </w:p>
     <w:p>
@@ -10557,7 +10571,7 @@
           <w:i w:val="0"/>
           <w:sz w:val="22"/>
         </w:rPr>
-        <w:t>Post-colour damage is the hidden cost that consumers discover only after purchasing, creating a cycle of colouring, damage, repair, and hesitation that suppresses repeat purchase frequency. The repair economy that has grown around hair colour damage - bond repair treatments, protein masks, deep conditioners - represents both a threat (consumers who stop colouring) and an opportunity (aftermarket products).</w:t>
+        <w:t>The damage conversation reveals a fundamental attribution error in the category: consumers blame the colour product for damage that is primarily caused by bleaching, over-processing, and poor aftercare - but they do not distinguish between these causes. The 152 positive items are consumers who found effective repair products or techniques, not consumers who had damage-free colouring experiences. This means 'damage' is being treated as an inevitable consequence of colouring rather than a preventable outcome. The 35 mixed-sentiment items (10.1%, the highest mixed proportion in the corpus) reflect consumers who love their colour result but resent the damage cost - a genuine value conflict that cannot be resolved by either better colour or better repair alone.</w:t>
       </w:r>
     </w:p>
     <w:p>
@@ -10586,7 +10600,7 @@
           <w:i w:val="0"/>
           <w:sz w:val="22"/>
         </w:rPr>
-        <w:t>Hair colour brands that ignore the damage conversation cede the post-colour relationship to haircare brands. Integrating repair into the colour product itself (bond-building technology in the dye) or bundling aftercare transforms the product from a single-purchase to a system sale.</w:t>
+        <w:t>Hair colour brands are losing consumers to category exit - some consumers stop colouring entirely because they believe damage is unavoidable. This is a category health threat, not just a brand challenge. The brands that proactively address damage prevention (not just damage repair) reduce category exit and increase lifetime colouring frequency. The opportunity is to reposition hair colour from a category that 'costs' hair health to one that 'includes' hair health.</w:t>
       </w:r>
     </w:p>
     <w:p>
@@ -10615,7 +10629,7 @@
           <w:i w:val="0"/>
           <w:sz w:val="22"/>
         </w:rPr>
-        <w:t>Bundle a post-colour conditioning treatment with every hair colour product. Develop a bond-repair technology that works during the colouring process, not just after. Market the colour + care system as a complete solution.</w:t>
+        <w:t>Integrate damage prevention into the colouring product itself: (1) Launch a 'Colour + Care' range where every colour product includes a pre-colour protector and post-colour conditioner in the same box - not as a separate purchase but as an integral part of the colour system. (2) Add 'hair health score' language on packaging and e-commerce (e.g., 'Contains Bond Repair Technology' or equivalent) that signals the brand takes damage seriously. (3) Create a hair health content series on YouTube and Instagram featuring trichologists explaining how to colour without damage, including bleach-specific guidance for trend colour users. (4) Develop a post-colour care regimen card (physical in-box and digital via QR code) with week-by-week aftercare instructions customised to the colour type used.</w:t>
       </w:r>
     </w:p>
     <w:p>
@@ -10644,7 +10658,7 @@
           <w:i w:val="0"/>
           <w:sz w:val="22"/>
         </w:rPr>
-        <w:t>Measure the correlation between post-colour damage experience and repeat purchase frequency. Test whether bundled aftercare products increase both satisfaction scores and repurchase rates.</w:t>
+        <w:t>Conduct a longitudinal hair health study (n=50, controlled groups using the brand's colour with and without the proposed pre/post-colour care system, measured at 0, 2, 4, and 8 weeks post-colouring) using standardised hair tensile strength and moisture measurements. Specific question: 'Does integrating a pre-colour protector and post-colour conditioner produce measurably less damage than the colour product alone?'</w:t>
       </w:r>
     </w:p>
     <w:p>
@@ -10929,7 +10943,7 @@
           <w:i w:val="0"/>
           <w:sz w:val="22"/>
         </w:rPr>
-        <w:t>223 consumer mentions (2.5% prevalence) specifically discuss beard and men's grooming colouring - beard dye, men's grey coverage for facial hair, moustache colour products. Product reviews mention Just For Men, Bigen, and Indian brands. Men express distinct needs from head hair colouring: faster application, no skin staining, and natural-looking results.</w:t>
+        <w:t>Beard &amp; Men's Grooming Colour has 223 items (2.5% prevalence) with positive sentiment (105 positive, 22 negative, 80 neutral, 16 mixed; NSS +37.2%). Present across all five platforms despite representing a small segment. Covers beard dyeing, men's grey coverage, and moustache colour.</w:t>
       </w:r>
     </w:p>
     <w:p>
@@ -10958,7 +10972,7 @@
           <w:i w:val="0"/>
           <w:sz w:val="22"/>
         </w:rPr>
-        <w:t>Men's beard colouring is an underserved but growing segment that is poorly addressed by head-hair-focused brands. Men who colour their beards want invisible maintenance - products that take under 5 minutes, leave no visible staining on skin, and produce results so natural that nobody notices. This is fundamentally different from the self-expression motivation driving women's fashion colour choices.</w:t>
+        <w:t>Men's grooming colour is a category that exists in practice but barely exists in marketing. The 223 items reveal an active consumer segment that is largely serving itself with women's products or generic unisex products. The 80 neutral items indicate men actively seeking product recommendations and guidance - a demand signal for a segment that most brands address as an afterthought SKU rather than a dedicated proposition. Men's colour needs are functionally distinct from women's (coarser hair texture, facial skin sensitivity, shorter processing time preference, different concealment goals - looking naturally dark vs. covering grey), but the market offers few products designed for these needs.</w:t>
       </w:r>
     </w:p>
     <w:p>
@@ -10987,7 +11001,7 @@
           <w:i w:val="0"/>
           <w:sz w:val="22"/>
         </w:rPr>
-        <w:t>Beard colour is a distinct product category, not a sub-segment of hair colour. Men's purchase journey, application context, and success criteria are different enough to warrant dedicated product development rather than 'also works on beards' positioning.</w:t>
+        <w:t>The men's grooming colour segment is underserved relative to demand. With 2.5% of corpus and growing male grooming consciousness in India, this represents an early-mover opportunity. Brands that launch dedicated men's colour lines now establish category ownership before the segment matures. The risk of inaction is that a new entrant (possibly from the men's grooming space - Bombay Shaving Company, The Man Company) captures this segment with a purpose-built proposition while hair colour incumbents treat it as an afterthought.</w:t>
       </w:r>
     </w:p>
     <w:p>
@@ -11016,7 +11030,7 @@
           <w:i w:val="0"/>
           <w:sz w:val="22"/>
         </w:rPr>
-        <w:t>Develop a dedicated beard colour line with male-specific packaging, application tools designed for facial hair (precision applicators, no-drip formulas), and marketing that normalises beard grooming as routine maintenance rather than vanity.</w:t>
+        <w:t>Launch a dedicated men's colour sub-brand or range: (1) Develop 3-5 beard and head colour SKUs with male-specific formulation (faster processing time under 10 minutes, natural-looking coverage rather than full colour change, reduced fragrance). (2) Distribute through men's grooming channels - barbershops, men's grooming e-commerce sections, and men's lifestyle influencer partnerships. (3) Create tutorial content specifically for men on YouTube (beard dyeing technique, quick grey coverage before meetings) featuring male creators in the 25-45 demographic. (4) Price competitively against existing men's grooming products, not against women's hair colour. (5) Position with masculine occasions and needs - professional appearance, wedding preparation, confidence for dating.</w:t>
       </w:r>
     </w:p>
     <w:p>
@@ -11045,7 +11059,7 @@
           <w:i w:val="0"/>
           <w:sz w:val="22"/>
         </w:rPr>
-        <w:t>Quantify the Indian men's beard colour market size and growth rate. Survey Indian men aged 30-55 to understand beard grey coverage frequency and current product satisfaction.</w:t>
+        <w:t>Conduct a quantitative demand assessment survey (n=400, men 25-50 in Indian metros, screened for beard/moustache or head hair greying) measuring current product usage, unmet needs, and purchase intent for a dedicated men's colour range. Key question: 'What product are you currently using to colour your beard/hair, and what would an ideal product designed specifically for men look like?'</w:t>
       </w:r>
     </w:p>
     <w:p>
@@ -11330,7 +11344,7 @@
           <w:i w:val="0"/>
           <w:sz w:val="22"/>
         </w:rPr>
-        <w:t>52 consumer mentions (0.6% prevalence) specifically discuss colour staining and transfer - dye staining skin, clothes, pillows, sinks, and floors. Consumers share cleanup tips and express frustration with products that leave marks. This is a low-prevalence but high-emotion pain point.</w:t>
+        <w:t>Colour Transfer &amp; Staining has only 52 items (0.6% prevalence) with positive-leaning sentiment (25 positive, 15 negative, 11 neutral, 1 mixed; NSS +19.2%). Flagged as contested. Present across all five platforms despite very small volume. Covers dye staining skin, clothes, pillows, and sinks.</w:t>
       </w:r>
     </w:p>
     <w:p>
@@ -11359,7 +11373,7 @@
           <w:i w:val="0"/>
           <w:sz w:val="22"/>
         </w:rPr>
-        <w:t>Colour staining is a silent purchase deterrent that rarely appears in product reviews but significantly affects the at-home colouring experience. Consumers who have experienced dye staining their bathroom, clothes, or pillowcase develop a lasting negative association with home colouring that makes them hesitant to repurchase, even from different brands.</w:t>
+        <w:t>Despite being the smallest theme, staining functions as a disproportionate barrier to repurchase and recommendation. The 15 negative mentions in a 52-item theme (28.8% negative rate - well above the corpus average of 11.9%) indicate concentrated dissatisfaction. Staining is a 'hygiene factor' in the Herzberg sense - resolving it does not generate delight, but failing at it generates outsized frustration. The positive items (25) are likely consumers celebrating stain-free products or sharing stain removal tips - meaning even positive staining conversation is framed around a problem to be solved rather than a benefit to be enjoyed.</w:t>
       </w:r>
     </w:p>
     <w:p>
@@ -11388,7 +11402,7 @@
           <w:i w:val="0"/>
           <w:sz w:val="22"/>
         </w:rPr>
-        <w:t>Anti-stain technology is an underinvested product feature that could become a meaningful differentiator. Consumers do not currently expect stain-free application, so delivering it would create genuine surprise and advocacy.</w:t>
+        <w:t>Staining may appear insignificant at 0.6% prevalence but it has a multiplier effect through the DIY experience theme (THM_04, 41.6%). Every staining incident during home colouring degrades the DIY experience and pushes consumers toward salon visits or category exit. Solving staining is a low-glamour, high-impact engineering challenge that most brands deprioritise in favour of shade innovation or marketing. The brand that demonstrably solves staining gains a quiet but powerful competitive advantage in consumer retention.</w:t>
       </w:r>
     </w:p>
     <w:p>
@@ -11417,7 +11431,7 @@
           <w:i w:val="0"/>
           <w:sz w:val="22"/>
         </w:rPr>
-        <w:t>Develop and prominently market anti-stain formulation technology. Include stain-prevention accessories (barrier cream, protective cape) in premium kits. Create content showing clean, mess-free application to counter the 'messy DIY' perception.</w:t>
+        <w:t>Address staining as a product engineering priority: (1) Include a 'stain guard' barrier cream sachet in every at-home colour kit for skin protection along hairline and ears. (2) Develop and market a colour-specific stain remover product (wipe format) sold as an accessory to colour kits. (3) Add clear stain prevention instructions with illustrations to in-pack guides and QR-linked video tutorials. (4) Test and certify 'low transfer' claims for pillow and clothing staining - if formulation allows, make this a marketing claim on packaging. (5) Feature 'no mess' as a key purchase driver in e-commerce product titles and A+ content, targeting the search terms consumers actually use when frustrated with staining.</w:t>
       </w:r>
     </w:p>
     <w:p>
@@ -11446,7 +11460,7 @@
           <w:i w:val="0"/>
           <w:sz w:val="22"/>
         </w:rPr>
-        <w:t>Survey home colour users to quantify how many have experienced staining and whether it affected their repurchase decision.</w:t>
+        <w:t>Conduct a product benchmarking test (controlled lab setting, n=30, comparing staining performance of 5 leading Indian hair colour brands on standardised fabric swatches and skin simulants) to establish a staining performance baseline. Specific question: 'Which brands and formats produce the least transfer to skin and fabric at 24 and 48 hours post-application?'</w:t>
       </w:r>
     </w:p>
     <w:p>
@@ -11734,7 +11748,7 @@
           <w:i w:val="0"/>
           <w:sz w:val="22"/>
         </w:rPr>
-        <w:t>86 consumer mentions (1.0% prevalence) contain viral claims about natural remedies that permanently reverse grey hair - coffee, amla, egg, lemon, coconut oil combinations promising results in 5 minutes. Counter-voices debunking these claims cite melanin science. This content is concentrated on Twitter and YouTube.</w:t>
+        <w:t>Grey Hair Misinformation &amp; Miracle Claims has 86 items (1.0% prevalence) with surprisingly positive sentiment (48 positive, 11 negative, 23 neutral, 4 mixed; NSS +43.0%). Present on Amazon, Reddit, Twitter, and YouTube but not Instagram. Despite small volume, this theme has a high positive NSS driven by consumers who believe the miracle claims.</w:t>
       </w:r>
     </w:p>
     <w:p>
@@ -11763,7 +11777,7 @@
           <w:i w:val="0"/>
           <w:sz w:val="22"/>
         </w:rPr>
-        <w:t>Grey hair misinformation thrives in the Indian social media ecosystem because it exploits two powerful cultural forces: trust in natural/home remedies and anxiety about premature ageing. These viral claims create unrealistic expectations that legitimate products cannot match, poisoning the well for evidence-based hair colour solutions.</w:t>
+        <w:t>The positive sentiment is itself the danger signal. The 48 positive items are consumers enthusiastically sharing or endorsing pseudoscientific grey reversal claims (onion juice, black seed oil, dietary supplements) - they are positive because they believe the misinformation, not because they have experienced results. This creates a competitive threat to legitimate hair colour products: if consumers believe grey can be reversed naturally, they delay or avoid purchasing hair colour entirely. The misinformation narrative is also a brand safety risk - any brand whose product appears adjacent to miracle claims in search results or social feeds suffers credibility contamination.</w:t>
       </w:r>
     </w:p>
     <w:p>
@@ -11792,7 +11806,7 @@
           <w:i w:val="0"/>
           <w:sz w:val="22"/>
         </w:rPr>
-        <w:t>Brands that engage with misinformation directly - through educational content debunking false claims while positioning their own product as the evidence-based alternative - can convert frustrated consumers who tried viral remedies and found them ineffective.</w:t>
+        <w:t>This small theme (1.0%) has outsized strategic importance because misinformation content is algorithmically amplified - miracle claims generate clicks, shares, and engagement that boost them in platform rankings. A brand that does not actively counter-programme this narrative risks having its products displaced in search and recommendation feeds by miracle cure content. The 86 items in the corpus likely represent a much larger volume of content that was filtered for relevance - the misinformation ecosystem extends far beyond brand-adjacent conversations.</w:t>
       </w:r>
     </w:p>
     <w:p>
@@ -11821,7 +11835,7 @@
           <w:i w:val="0"/>
           <w:sz w:val="22"/>
         </w:rPr>
-        <w:t>Create a fact-based content series addressing common grey hair myths, partnering with dermatologists. Position the brand as the honest alternative: 'We cannot reverse grey hair. Nobody can. But we can cover it safely and beautifully.'</w:t>
+        <w:t>Deploy a proactive counter-misinformation strategy: (1) Commission and publish a consumer-friendly explainer with a trichologist or dermatologist debunking the top 5 grey hair reversal myths, formatted for YouTube (3-5 min), Instagram carousel, and WhatsApp shareability. (2) Run Google and YouTube Ads targeting grey hair reversal search queries ('reverse grey hair naturally', 'onion juice for grey hair') with educational content that redirects to the brand's grey coverage solutions. (3) Create a Reddit AMA with a dermatologist on r/IndianSkincareAddicts or r/India addressing hair colour myths. (4) Monitor Amazon product Q&amp;A sections for miracle claims adjacent to hair colour listings and respond with factual information.</w:t>
       </w:r>
     </w:p>
     <w:p>
@@ -11850,7 +11864,7 @@
           <w:i w:val="0"/>
           <w:sz w:val="22"/>
         </w:rPr>
-        <w:t>Monitor the volume and engagement of grey hair miracle claim content on Indian social media. Test whether counter-misinformation content increases brand trust scores.</w:t>
+        <w:t>Conduct a content analysis (sample 500 grey hair reversal claims from YouTube and social media, coded by claim type, evidence cited, and engagement metrics) to map the misinformation landscape and identify the most viral claim categories. Specific question: 'Which grey reversal claims have the highest engagement-to-debunking ratio - i.e., which myths are most believed and least challenged?'</w:t>
       </w:r>
     </w:p>
     <w:p>
@@ -12517,7 +12531,7 @@
           <w:i w:val="0"/>
           <w:sz w:val="22"/>
         </w:rPr>
-        <w:t>Automated collection across Amazon, Instagram, Reddit, Twitter, Youtube. Engagement-minimum filters applied at collection time.</w:t>
+        <w:t>Data ingested from external sources across Amazon, Instagram, Reddit, Twitter, Youtube. Original collection methodology unknown.</w:t>
       </w:r>
     </w:p>
     <w:p>
@@ -13469,7 +13483,7 @@
           <w:i w:val="0"/>
           <w:sz w:val="22"/>
         </w:rPr>
-        <w:t>Primary: India. Content selected and filtered for relevance to the India market context. Items originating from other geographies are retained where they contribute relevant consumer perspective (e.g., diaspora experiences, cross-market comparisons).</w:t>
+        <w:t>Primary market context: India. Content is collected using market-specific queries (brand names, regional terms, India-specific keywords) and filtered for topical relevance. However, no platform provides verified geolocation data. Geographic origin is inferred from context (language, currency references, retailer mentions, cultural markers) rather than verified. Audit of comparable studies found 2-3% of corpus items originate from non-target markets (e.g., US product listings, UK healthcare discussions) that pass topical relevance filters. Findings in this report describe conversations about the brand in the India market context, not verified conversations from India consumers.</w:t>
       </w:r>
     </w:p>
     <w:p>

</xml_diff>